<commit_message>
feat(experience): introduce the reliability ledger
</commit_message>
<xml_diff>
--- a/public/cv/oscar-ndugbu-cv.docx
+++ b/public/cv/oscar-ndugbu-cv.docx
@@ -65,7 +65,7 @@
                 <w:sz w:val="19"/>
                 <w:szCs w:val="19"/>
               </w:rPr>
-              <w:t xml:space="preserve">Principal Backend Engineer  ·  Infrastructure &amp; SRE Architect  ·  AI Systems</w:t>
+              <w:t>Staff Backend and Platform Engineer  ·  AI Infrastructure  ·  Reliability</w:t>
             </w:r>
           </w:p>
         </w:tc>
@@ -175,16 +175,16 @@
           <w:sz w:val="20"/>
           <w:szCs w:val="20"/>
         </w:rPr>
-        <w:t xml:space="preserve">Backend engineer and platform architect</w:t>
-      </w:r>
-      <w:r>
-        <w:rPr>
-          <w:rFonts w:ascii="Calibri" w:cs="Calibri" w:eastAsia="Calibri" w:hAnsi="Calibri"/>
-          <w:color w:val="0F1923"/>
-          <w:sz w:val="20"/>
-          <w:szCs w:val="20"/>
-        </w:rPr>
-        <w:t xml:space="preserve"> with four years of independent product and consulting work — shipping a tax compliance platform, an AI-powered observability tool, and an encrypted blockchain data system — and over a decade building and maintaining critical data infrastructure within Nigeria's federal public sector.</w:t>
+        <w:t>Staff backend and platform engineer</w:t>
+      </w:r>
+      <w:r>
+        <w:rPr>
+          <w:rFonts w:ascii="Calibri" w:cs="Calibri" w:eastAsia="Calibri" w:hAnsi="Calibri"/>
+          <w:color w:val="0F1923"/>
+          <w:sz w:val="20"/>
+          <w:szCs w:val="20"/>
+        </w:rPr>
+        <w:t xml:space="preserve"> with independent product and consulting work across tax workflows, AI-assisted observability, and encrypted data systems — anchored by over a decade building and maintaining data infrastructure within Nigeria's federal public sector.</w:t>
       </w:r>
     </w:p>
     <w:p>
@@ -209,16 +209,16 @@
           <w:sz w:val="20"/>
           <w:szCs w:val="20"/>
         </w:rPr>
-        <w:t xml:space="preserve">Node.js and TypeScript backend systems, distributed architecture, and cloud infrastructure</w:t>
-      </w:r>
-      <w:r>
-        <w:rPr>
-          <w:rFonts w:ascii="Calibri" w:cs="Calibri" w:eastAsia="Calibri" w:hAnsi="Calibri"/>
-          <w:color w:val="0F1923"/>
-          <w:sz w:val="20"/>
-          <w:szCs w:val="20"/>
-        </w:rPr>
-        <w:t xml:space="preserve"> engineered to stay fast and reliable under real-world load — consistently delivering sub-150ms API response times and 99.9%+ uptime. Equally at home applying machine learning to hard engineering problems, and fluent in translating technical trade-offs into clear business terms. Author of three open-source tools in active use.</w:t>
+        <w:t>Node.js and TypeScript backend systems, distributed architecture, and cloud infrastructure</w:t>
+      </w:r>
+      <w:r>
+        <w:rPr>
+          <w:rFonts w:ascii="Calibri" w:cs="Calibri" w:eastAsia="Calibri" w:hAnsi="Calibri"/>
+          <w:color w:val="0F1923"/>
+          <w:sz w:val="20"/>
+          <w:szCs w:val="20"/>
+        </w:rPr>
+        <w:t xml:space="preserve"> engineered around explicit failure modes, observable behavior, and clean operational handoffs. Applies machine learning where it improves a system decision, and translates technical trade-offs into clear business terms. Author of three public engineering tools.</w:t>
       </w:r>
     </w:p>
     <w:p>
@@ -740,7 +740,7 @@
           <w:sz w:val="19"/>
           <w:szCs w:val="19"/>
         </w:rPr>
-        <w:t xml:space="preserve">Independent Consulting</w:t>
+        <w:t>Independent Consulting  ·  Remote</w:t>
       </w:r>
       <w:r>
         <w:rPr>
@@ -749,7 +749,6 @@
           <w:sz w:val="19"/>
           <w:szCs w:val="19"/>
         </w:rPr>
-        <w:t xml:space="preserve">  ·  </w:t>
       </w:r>
       <w:r>
         <w:rPr>
@@ -760,7 +759,6 @@
           <w:sz w:val="19"/>
           <w:szCs w:val="19"/>
         </w:rPr>
-        <w:t xml:space="preserve">Remote · Clients across West Africa &amp; Europe</w:t>
       </w:r>
     </w:p>
     <w:p>
@@ -797,16 +795,16 @@
           <w:sz w:val="20"/>
           <w:szCs w:val="20"/>
         </w:rPr>
-        <w:t xml:space="preserve">Built an AI-assisted incident diagnosis tool</w:t>
-      </w:r>
-      <w:r>
-        <w:rPr>
-          <w:rFonts w:ascii="Calibri" w:cs="Calibri" w:eastAsia="Calibri" w:hAnsi="Calibri"/>
-          <w:color w:val="0F1923"/>
-          <w:sz w:val="20"/>
-          <w:szCs w:val="20"/>
-        </w:rPr>
-        <w:t xml:space="preserve"> that ingests live server logs and surfaces the most probable root causes in plain English — cutting engineer investigation time from several hours to a fraction of that, across multiple client environments.</w:t>
+        <w:t>Built an AI-assisted incident diagnosis tool</w:t>
+      </w:r>
+      <w:r>
+        <w:rPr>
+          <w:rFonts w:ascii="Calibri" w:cs="Calibri" w:eastAsia="Calibri" w:hAnsi="Calibri"/>
+          <w:color w:val="0F1923"/>
+          <w:sz w:val="20"/>
+          <w:szCs w:val="20"/>
+        </w:rPr>
+        <w:t xml:space="preserve"> that turns live server logs into ranked root-cause hypotheses and preserves the evidence path for engineer review.</w:t>
       </w:r>
     </w:p>
     <w:p>
@@ -827,16 +825,16 @@
           <w:sz w:val="20"/>
           <w:szCs w:val="20"/>
         </w:rPr>
-        <w:t xml:space="preserve">Conducted backend performance audits</w:t>
-      </w:r>
-      <w:r>
-        <w:rPr>
-          <w:rFonts w:ascii="Calibri" w:cs="Calibri" w:eastAsia="Calibri" w:hAnsi="Calibri"/>
-          <w:color w:val="0F1923"/>
-          <w:sz w:val="20"/>
-          <w:szCs w:val="20"/>
-        </w:rPr>
-        <w:t xml:space="preserve"> across multiple fintech platforms — identifying and resolving slow database queries, connection pool exhaustion, and API latency spikes — with documented reliability and uptime improvements delivered in every engagement.</w:t>
+        <w:t>Conducted backend performance audits</w:t>
+      </w:r>
+      <w:r>
+        <w:rPr>
+          <w:rFonts w:ascii="Calibri" w:cs="Calibri" w:eastAsia="Calibri" w:hAnsi="Calibri"/>
+          <w:color w:val="0F1923"/>
+          <w:sz w:val="20"/>
+          <w:szCs w:val="20"/>
+        </w:rPr>
+        <w:t xml:space="preserve"> across fintech systems — identifying slow database queries, connection-pool exhaustion, and API latency spikes, then delivering written remediation plans tied to observable bottlenecks.</w:t>
       </w:r>
     </w:p>
     <w:p>
@@ -857,36 +855,34 @@
           <w:sz w:val="20"/>
           <w:szCs w:val="20"/>
         </w:rPr>
-        <w:t xml:space="preserve">Designed proactive monitoring pipelines</w:t>
-      </w:r>
-      <w:r>
-        <w:rPr>
-          <w:rFonts w:ascii="Calibri" w:cs="Calibri" w:eastAsia="Calibri" w:hAnsi="Calibri"/>
-          <w:color w:val="0F1923"/>
-          <w:sz w:val="20"/>
-          <w:szCs w:val="20"/>
-        </w:rPr>
-        <w:t xml:space="preserve"> that detect system anomalies before end users are impacted, reducing on-call alert volume by roughly </w:t>
-      </w:r>
-      <w:r>
-        <w:rPr>
-          <w:rFonts w:ascii="Calibri" w:cs="Calibri" w:eastAsia="Calibri" w:hAnsi="Calibri"/>
-          <w:b/>
-          <w:bCs/>
-          <w:color w:val="0F1923"/>
-          <w:sz w:val="20"/>
-          <w:szCs w:val="20"/>
-        </w:rPr>
-        <w:t xml:space="preserve">40%</w:t>
-      </w:r>
-      <w:r>
-        <w:rPr>
-          <w:rFonts w:ascii="Calibri" w:cs="Calibri" w:eastAsia="Calibri" w:hAnsi="Calibri"/>
-          <w:color w:val="0F1923"/>
-          <w:sz w:val="20"/>
-          <w:szCs w:val="20"/>
-        </w:rPr>
-        <w:t xml:space="preserve"> and cutting incident response pressure across client teams.</w:t>
+        <w:t>Designed proactive monitoring pipelines</w:t>
+      </w:r>
+      <w:r>
+        <w:rPr>
+          <w:rFonts w:ascii="Calibri" w:cs="Calibri" w:eastAsia="Calibri" w:hAnsi="Calibri"/>
+          <w:color w:val="0F1923"/>
+          <w:sz w:val="20"/>
+          <w:szCs w:val="20"/>
+        </w:rPr>
+        <w:t xml:space="preserve"> that surface anomalous behavior with enough context for an engineer to investigate before a local fault becomes a wider incident.</w:t>
+      </w:r>
+      <w:r>
+        <w:rPr>
+          <w:rFonts w:ascii="Calibri" w:cs="Calibri" w:eastAsia="Calibri" w:hAnsi="Calibri"/>
+          <w:b/>
+          <w:bCs/>
+          <w:color w:val="0F1923"/>
+          <w:sz w:val="20"/>
+          <w:szCs w:val="20"/>
+        </w:rPr>
+      </w:r>
+      <w:r>
+        <w:rPr>
+          <w:rFonts w:ascii="Calibri" w:cs="Calibri" w:eastAsia="Calibri" w:hAnsi="Calibri"/>
+          <w:color w:val="0F1923"/>
+          <w:sz w:val="20"/>
+          <w:szCs w:val="20"/>
+        </w:rPr>
       </w:r>
     </w:p>
     <w:p>
@@ -995,16 +991,16 @@
           <w:sz w:val="20"/>
           <w:szCs w:val="20"/>
         </w:rPr>
-        <w:t xml:space="preserve">Designed and built the core transfer backend</w:t>
-      </w:r>
-      <w:r>
-        <w:rPr>
-          <w:rFonts w:ascii="Calibri" w:cs="Calibri" w:eastAsia="Calibri" w:hAnsi="Calibri"/>
-          <w:color w:val="0F1923"/>
-          <w:sz w:val="20"/>
-          <w:szCs w:val="20"/>
-        </w:rPr>
-        <w:t xml:space="preserve"> handling multi-gigabyte AES-256-encrypted payloads across four blockchain networks simultaneously — with automatic retry on failure and a complete transaction audit record — achieving a zero data-loss record throughout.</w:t>
+        <w:t>Designed and built the core transfer backend</w:t>
+      </w:r>
+      <w:r>
+        <w:rPr>
+          <w:rFonts w:ascii="Calibri" w:cs="Calibri" w:eastAsia="Calibri" w:hAnsi="Calibri"/>
+          <w:color w:val="0F1923"/>
+          <w:sz w:val="20"/>
+          <w:szCs w:val="20"/>
+        </w:rPr>
+        <w:t xml:space="preserve"> for AES-256-encrypted payloads across four blockchain networks, with retry semantics, checkpointed progress, and a transaction audit record designed for recovery after interruption.</w:t>
       </w:r>
     </w:p>
     <w:p>
@@ -1025,36 +1021,34 @@
           <w:sz w:val="20"/>
           <w:szCs w:val="20"/>
         </w:rPr>
-        <w:t xml:space="preserve">Integrated Zero-Knowledge proof pipelines</w:t>
-      </w:r>
-      <w:r>
-        <w:rPr>
-          <w:rFonts w:ascii="Calibri" w:cs="Calibri" w:eastAsia="Calibri" w:hAnsi="Calibri"/>
-          <w:color w:val="0F1923"/>
-          <w:sz w:val="20"/>
-          <w:szCs w:val="20"/>
-        </w:rPr>
-        <w:t xml:space="preserve"> (a cryptographic method that validates data without exposing it) to enable privacy-preserving regulatory reporting, with GDPR compliance and </w:t>
-      </w:r>
-      <w:r>
-        <w:rPr>
-          <w:rFonts w:ascii="Calibri" w:cs="Calibri" w:eastAsia="Calibri" w:hAnsi="Calibri"/>
-          <w:b/>
-          <w:bCs/>
-          <w:color w:val="0F1923"/>
-          <w:sz w:val="20"/>
-          <w:szCs w:val="20"/>
-        </w:rPr>
-        <w:t xml:space="preserve">90% automated test coverage</w:t>
-      </w:r>
-      <w:r>
-        <w:rPr>
-          <w:rFonts w:ascii="Calibri" w:cs="Calibri" w:eastAsia="Calibri" w:hAnsi="Calibri"/>
-          <w:color w:val="0F1923"/>
-          <w:sz w:val="20"/>
-          <w:szCs w:val="20"/>
-        </w:rPr>
-        <w:t xml:space="preserve"> across all integration points.</w:t>
+        <w:t>Integrated Zero-Knowledge proof pipelines</w:t>
+      </w:r>
+      <w:r>
+        <w:rPr>
+          <w:rFonts w:ascii="Calibri" w:cs="Calibri" w:eastAsia="Calibri" w:hAnsi="Calibri"/>
+          <w:color w:val="0F1923"/>
+          <w:sz w:val="20"/>
+          <w:szCs w:val="20"/>
+        </w:rPr>
+        <w:t xml:space="preserve"> to validate data without exposing it, supporting privacy-preserving reporting with tests across the integration boundaries. This architecture is not presented as regulator certification.</w:t>
+      </w:r>
+      <w:r>
+        <w:rPr>
+          <w:rFonts w:ascii="Calibri" w:cs="Calibri" w:eastAsia="Calibri" w:hAnsi="Calibri"/>
+          <w:b/>
+          <w:bCs/>
+          <w:color w:val="0F1923"/>
+          <w:sz w:val="20"/>
+          <w:szCs w:val="20"/>
+        </w:rPr>
+      </w:r>
+      <w:r>
+        <w:rPr>
+          <w:rFonts w:ascii="Calibri" w:cs="Calibri" w:eastAsia="Calibri" w:hAnsi="Calibri"/>
+          <w:color w:val="0F1923"/>
+          <w:sz w:val="20"/>
+          <w:szCs w:val="20"/>
+        </w:rPr>
       </w:r>
     </w:p>
     <w:p>
@@ -1223,36 +1217,34 @@
           <w:sz w:val="20"/>
           <w:szCs w:val="20"/>
         </w:rPr>
-        <w:t xml:space="preserve">Reduced data preparation time by over 40%</w:t>
-      </w:r>
-      <w:r>
-        <w:rPr>
-          <w:rFonts w:ascii="Calibri" w:cs="Calibri" w:eastAsia="Calibri" w:hAnsi="Calibri"/>
-          <w:color w:val="0F1923"/>
-          <w:sz w:val="20"/>
-          <w:szCs w:val="20"/>
-        </w:rPr>
-        <w:t xml:space="preserve"> through workflow automation, while maintaining a </w:t>
-      </w:r>
-      <w:r>
-        <w:rPr>
-          <w:rFonts w:ascii="Calibri" w:cs="Calibri" w:eastAsia="Calibri" w:hAnsi="Calibri"/>
-          <w:b/>
-          <w:bCs/>
-          <w:color w:val="0F1923"/>
-          <w:sz w:val="20"/>
-          <w:szCs w:val="20"/>
-        </w:rPr>
-        <w:t xml:space="preserve">clean record across every federal compliance audit</w:t>
-      </w:r>
-      <w:r>
-        <w:rPr>
-          <w:rFonts w:ascii="Calibri" w:cs="Calibri" w:eastAsia="Calibri" w:hAnsi="Calibri"/>
-          <w:color w:val="0F1923"/>
-          <w:sz w:val="20"/>
-          <w:szCs w:val="20"/>
-        </w:rPr>
-        <w:t xml:space="preserve"> since the systems went live.</w:t>
+        <w:t>Automated repeated validation and consolidation steps</w:t>
+      </w:r>
+      <w:r>
+        <w:rPr>
+          <w:rFonts w:ascii="Calibri" w:cs="Calibri" w:eastAsia="Calibri" w:hAnsi="Calibri"/>
+          <w:color w:val="0F1923"/>
+          <w:sz w:val="20"/>
+          <w:szCs w:val="20"/>
+        </w:rPr>
+        <w:t>, making the preparation path more traceable while preserving human review for inconsistent state submissions.</w:t>
+      </w:r>
+      <w:r>
+        <w:rPr>
+          <w:rFonts w:ascii="Calibri" w:cs="Calibri" w:eastAsia="Calibri" w:hAnsi="Calibri"/>
+          <w:b/>
+          <w:bCs/>
+          <w:color w:val="0F1923"/>
+          <w:sz w:val="20"/>
+          <w:szCs w:val="20"/>
+        </w:rPr>
+      </w:r>
+      <w:r>
+        <w:rPr>
+          <w:rFonts w:ascii="Calibri" w:cs="Calibri" w:eastAsia="Calibri" w:hAnsi="Calibri"/>
+          <w:color w:val="0F1923"/>
+          <w:sz w:val="20"/>
+          <w:szCs w:val="20"/>
+        </w:rPr>
       </w:r>
     </w:p>
     <w:p>
@@ -1341,27 +1333,26 @@
           <w:sz w:val="20"/>
           <w:szCs w:val="20"/>
         </w:rPr>
-        <w:t xml:space="preserve">Automates the full tax filing workflow for Nigerian small businesses with FIRS (Nigeria's Federal Inland Revenue Service) — cutting filing time </w:t>
-      </w:r>
-      <w:r>
-        <w:rPr>
-          <w:rFonts w:ascii="Calibri" w:cs="Calibri" w:eastAsia="Calibri" w:hAnsi="Calibri"/>
-          <w:b/>
-          <w:bCs/>
-          <w:color w:val="0F1923"/>
-          <w:sz w:val="20"/>
-          <w:szCs w:val="20"/>
-        </w:rPr>
-        <w:t xml:space="preserve">from ~4 hours to ~15 minutes.</w:t>
-      </w:r>
-      <w:r>
-        <w:rPr>
-          <w:rFonts w:ascii="Calibri" w:cs="Calibri" w:eastAsia="Calibri" w:hAnsi="Calibri"/>
-          <w:color w:val="0F1923"/>
-          <w:sz w:val="20"/>
-          <w:szCs w:val="20"/>
-        </w:rPr>
-        <w:t xml:space="preserve"> Each client's data is isolated at the database level and physically inaccessible to any other client, even in the presence of an application bug.</w:t>
+        <w:t>Designed a replay-safe tax filing workflow for Nigerian small businesses, with Nigeria Revenue Service integration in progress.</w:t>
+      </w:r>
+      <w:r>
+        <w:rPr>
+          <w:rFonts w:ascii="Calibri" w:cs="Calibri" w:eastAsia="Calibri" w:hAnsi="Calibri"/>
+          <w:b/>
+          <w:bCs/>
+          <w:color w:val="0F1923"/>
+          <w:sz w:val="20"/>
+          <w:szCs w:val="20"/>
+        </w:rPr>
+      </w:r>
+      <w:r>
+        <w:rPr>
+          <w:rFonts w:ascii="Calibri" w:cs="Calibri" w:eastAsia="Calibri" w:hAnsi="Calibri"/>
+          <w:color w:val="0F1923"/>
+          <w:sz w:val="20"/>
+          <w:szCs w:val="20"/>
+        </w:rPr>
+        <w:t xml:space="preserve"> PostgreSQL Row-Level Security enforces tenant scope at the database layer instead of relying only on application filters.</w:t>
       </w:r>
     </w:p>
     <w:p>
@@ -1380,27 +1371,26 @@
           <w:sz w:val="20"/>
           <w:szCs w:val="20"/>
         </w:rPr>
-        <w:t xml:space="preserve">Real-time tax calculations render in </w:t>
-      </w:r>
-      <w:r>
-        <w:rPr>
-          <w:rFonts w:ascii="Calibri" w:cs="Calibri" w:eastAsia="Calibri" w:hAnsi="Calibri"/>
-          <w:b/>
-          <w:bCs/>
-          <w:color w:val="0F1923"/>
-          <w:sz w:val="20"/>
-          <w:szCs w:val="20"/>
-        </w:rPr>
-        <w:t xml:space="preserve">under 150ms</w:t>
-      </w:r>
-      <w:r>
-        <w:rPr>
-          <w:rFonts w:ascii="Calibri" w:cs="Calibri" w:eastAsia="Calibri" w:hAnsi="Calibri"/>
-          <w:color w:val="0F1923"/>
-          <w:sz w:val="20"/>
-          <w:szCs w:val="20"/>
-        </w:rPr>
-        <w:t xml:space="preserve"> under load; an idempotent job-queue ensures no submission is ever processed twice — even through a mid-request server failure — and every transaction is backed by an immutable, hash-chained audit trail.</w:t>
+        <w:t>Separates interactive calculation from external submission.</w:t>
+      </w:r>
+      <w:r>
+        <w:rPr>
+          <w:rFonts w:ascii="Calibri" w:cs="Calibri" w:eastAsia="Calibri" w:hAnsi="Calibri"/>
+          <w:b/>
+          <w:bCs/>
+          <w:color w:val="0F1923"/>
+          <w:sz w:val="20"/>
+          <w:szCs w:val="20"/>
+        </w:rPr>
+      </w:r>
+      <w:r>
+        <w:rPr>
+          <w:rFonts w:ascii="Calibri" w:cs="Calibri" w:eastAsia="Calibri" w:hAnsi="Calibri"/>
+          <w:color w:val="0F1923"/>
+          <w:sz w:val="20"/>
+          <w:szCs w:val="20"/>
+        </w:rPr>
+        <w:t xml:space="preserve"> Stable job identities, idempotent workers, and a hash-chained audit trail make retries and reconciliation inspectable after a partial failure.</w:t>
       </w:r>
     </w:p>
     <w:p>
@@ -1419,32 +1409,32 @@
           <w:sz w:val="20"/>
           <w:szCs w:val="20"/>
         </w:rPr>
-        <w:t xml:space="preserve">Deployed with AES-256 encryption at rest, automated zero-downtime releases, and a CI/CD pipeline with </w:t>
-      </w:r>
-      <w:r>
-        <w:rPr>
-          <w:rFonts w:ascii="Calibri" w:cs="Calibri" w:eastAsia="Calibri" w:hAnsi="Calibri"/>
-          <w:b/>
-          <w:bCs/>
-          <w:color w:val="0F1923"/>
-          <w:sz w:val="20"/>
-          <w:szCs w:val="20"/>
-        </w:rPr>
-        <w:t xml:space="preserve">95% test coverage</w:t>
-      </w:r>
-      <w:r>
-        <w:rPr>
-          <w:rFonts w:ascii="Calibri" w:cs="Calibri" w:eastAsia="Calibri" w:hAnsi="Calibri"/>
-          <w:color w:val="0F1923"/>
-          <w:sz w:val="20"/>
-          <w:szCs w:val="20"/>
-        </w:rPr>
-        <w:t xml:space="preserve"> — built to withstand FIRS audit scrutiny.</w:t>
-      </w:r>
-    </w:p>
-    <w:p>
-      <w:pPr>
-        <w:spacing w:before="150" w:after="6"/>
+        <w:t>Uses encrypted storage, release automation, and executable tests across calculation and submission state transitions.</w:t>
+      </w:r>
+      <w:r>
+        <w:rPr>
+          <w:rFonts w:ascii="Calibri" w:cs="Calibri" w:eastAsia="Calibri" w:hAnsi="Calibri"/>
+          <w:b/>
+          <w:bCs/>
+          <w:color w:val="0F1923"/>
+          <w:sz w:val="20"/>
+          <w:szCs w:val="20"/>
+        </w:rPr>
+      </w:r>
+      <w:r>
+        <w:rPr>
+          <w:rFonts w:ascii="Calibri" w:cs="Calibri" w:eastAsia="Calibri" w:hAnsi="Calibri"/>
+          <w:color w:val="0F1923"/>
+          <w:sz w:val="20"/>
+          <w:szCs w:val="20"/>
+        </w:rPr>
+        <w:t xml:space="preserve"> Private integration evidence is available for review and is not presented as agency approval.</w:t>
+      </w:r>
+    </w:p>
+    <w:p>
+      <w:pPr>
+        <w:keepNext/>
+        <w:spacing w:before="240" w:after="6"/>
       </w:pPr>
       <w:r>
         <w:rPr>
@@ -1455,7 +1445,8 @@
           <w:sz w:val="21"/>
           <w:szCs w:val="21"/>
         </w:rPr>
-        <w:t xml:space="preserve">SabiScore</w:t>
+        <w:br/>
+        <w:t>SabiScore</w:t>
       </w:r>
       <w:r>
         <w:rPr>
@@ -1508,27 +1499,25 @@
           <w:sz w:val="20"/>
           <w:szCs w:val="20"/>
         </w:rPr>
-        <w:t xml:space="preserve">A machine learning platform that generates predictions and continuously monitors its own output quality — alerting engineers the moment a model begins degrading, before any user is affected. Sustains </w:t>
-      </w:r>
-      <w:r>
-        <w:rPr>
-          <w:rFonts w:ascii="Calibri" w:cs="Calibri" w:eastAsia="Calibri" w:hAnsi="Calibri"/>
-          <w:b/>
-          <w:bCs/>
-          <w:color w:val="0F1923"/>
-          <w:sz w:val="20"/>
-          <w:szCs w:val="20"/>
-        </w:rPr>
-        <w:t xml:space="preserve">99.9%+ uptime</w:t>
-      </w:r>
-      <w:r>
-        <w:rPr>
-          <w:rFonts w:ascii="Calibri" w:cs="Calibri" w:eastAsia="Calibri" w:hAnsi="Calibri"/>
-          <w:color w:val="0F1923"/>
-          <w:sz w:val="20"/>
-          <w:szCs w:val="20"/>
-        </w:rPr>
-        <w:t xml:space="preserve"> in production.</w:t>
+        <w:t>An ensemble inference platform with versioned caching, delivery telemetry, and a deterministic fallback path when model output is unavailable.</w:t>
+      </w:r>
+      <w:r>
+        <w:rPr>
+          <w:rFonts w:ascii="Calibri" w:cs="Calibri" w:eastAsia="Calibri" w:hAnsi="Calibri"/>
+          <w:b/>
+          <w:bCs/>
+          <w:color w:val="0F1923"/>
+          <w:sz w:val="20"/>
+          <w:szCs w:val="20"/>
+        </w:rPr>
+      </w:r>
+      <w:r>
+        <w:rPr>
+          <w:rFonts w:ascii="Calibri" w:cs="Calibri" w:eastAsia="Calibri" w:hAnsi="Calibri"/>
+          <w:color w:val="0F1923"/>
+          <w:sz w:val="20"/>
+          <w:szCs w:val="20"/>
+        </w:rPr>
       </w:r>
     </w:p>
     <w:p>
@@ -1547,27 +1536,26 @@
           <w:sz w:val="20"/>
           <w:szCs w:val="20"/>
         </w:rPr>
-        <w:t xml:space="preserve">Optimised ensemble AI inference response time by </w:t>
-      </w:r>
-      <w:r>
-        <w:rPr>
-          <w:rFonts w:ascii="Calibri" w:cs="Calibri" w:eastAsia="Calibri" w:hAnsi="Calibri"/>
-          <w:b/>
-          <w:bCs/>
-          <w:color w:val="0F1923"/>
-          <w:sz w:val="20"/>
-          <w:szCs w:val="20"/>
-        </w:rPr>
-        <w:t xml:space="preserve">~30%</w:t>
-      </w:r>
-      <w:r>
-        <w:rPr>
-          <w:rFonts w:ascii="Calibri" w:cs="Calibri" w:eastAsia="Calibri" w:hAnsi="Calibri"/>
-          <w:color w:val="0F1923"/>
-          <w:sz w:val="20"/>
-          <w:szCs w:val="20"/>
-        </w:rPr>
-        <w:t xml:space="preserve"> through query and caching improvements; event pipeline handles sustained high throughput with built-in fault tolerance and automatic dead-letter recovery.</w:t>
+        <w:t>Separated inference work from repeated reads through a model-versioned cache;</w:t>
+      </w:r>
+      <w:r>
+        <w:rPr>
+          <w:rFonts w:ascii="Calibri" w:cs="Calibri" w:eastAsia="Calibri" w:hAnsi="Calibri"/>
+          <w:b/>
+          <w:bCs/>
+          <w:color w:val="0F1923"/>
+          <w:sz w:val="20"/>
+          <w:szCs w:val="20"/>
+        </w:rPr>
+      </w:r>
+      <w:r>
+        <w:rPr>
+          <w:rFonts w:ascii="Calibri" w:cs="Calibri" w:eastAsia="Calibri" w:hAnsi="Calibri"/>
+          <w:color w:val="0F1923"/>
+          <w:sz w:val="20"/>
+          <w:szCs w:val="20"/>
+        </w:rPr>
+        <w:t xml:space="preserve"> the event path uses bounded retries and dead-letter recovery instead of silently dropping failed work.</w:t>
       </w:r>
     </w:p>
     <w:p>
@@ -1586,27 +1574,25 @@
           <w:sz w:val="20"/>
           <w:szCs w:val="20"/>
         </w:rPr>
-        <w:t xml:space="preserve">Prometheus and Grafana monitoring stack provides full visibility into model accuracy, latency, and system health — reducing mean time to diagnosis by roughly </w:t>
-      </w:r>
-      <w:r>
-        <w:rPr>
-          <w:rFonts w:ascii="Calibri" w:cs="Calibri" w:eastAsia="Calibri" w:hAnsi="Calibri"/>
-          <w:b/>
-          <w:bCs/>
-          <w:color w:val="0F1923"/>
-          <w:sz w:val="20"/>
-          <w:szCs w:val="20"/>
-        </w:rPr>
-        <w:t xml:space="preserve">45%</w:t>
-      </w:r>
-      <w:r>
-        <w:rPr>
-          <w:rFonts w:ascii="Calibri" w:cs="Calibri" w:eastAsia="Calibri" w:hAnsi="Calibri"/>
-          <w:color w:val="0F1923"/>
-          <w:sz w:val="20"/>
-          <w:szCs w:val="20"/>
-        </w:rPr>
-        <w:t xml:space="preserve"> compared to reactive alerting.</w:t>
+        <w:t>Prometheus and Grafana expose model delivery, latency, and service-health signals so an engineer can trace a degraded response to its source.</w:t>
+      </w:r>
+      <w:r>
+        <w:rPr>
+          <w:rFonts w:ascii="Calibri" w:cs="Calibri" w:eastAsia="Calibri" w:hAnsi="Calibri"/>
+          <w:b/>
+          <w:bCs/>
+          <w:color w:val="0F1923"/>
+          <w:sz w:val="20"/>
+          <w:szCs w:val="20"/>
+        </w:rPr>
+      </w:r>
+      <w:r>
+        <w:rPr>
+          <w:rFonts w:ascii="Calibri" w:cs="Calibri" w:eastAsia="Calibri" w:hAnsi="Calibri"/>
+          <w:color w:val="0F1923"/>
+          <w:sz w:val="20"/>
+          <w:szCs w:val="20"/>
+        </w:rPr>
       </w:r>
     </w:p>
     <w:p>
@@ -1748,7 +1734,7 @@
                 <w:sz w:val="17"/>
                 <w:szCs w:val="17"/>
               </w:rPr>
-              <w:t xml:space="preserve">Enforces strict database-level data separation between clients — one tenant's records are completely invisible to another, even when application-layer bugs exist. Used in production by fintech teams.</w:t>
+              <w:t>Provides database-level tenant scoping with PostgreSQL RLS, reducing reliance on application filters and making isolation tests explicit.</w:t>
             </w:r>
           </w:p>
         </w:tc>
@@ -1850,7 +1836,7 @@
                 <w:sz w:val="17"/>
                 <w:szCs w:val="17"/>
               </w:rPr>
-              <w:t xml:space="preserve">Generates a cryptographically linked audit log where every entry is mathematically bound to the previous one, making retroactive edits or tampering instantly detectable. Built for FIRS and GDPR audit trails.</w:t>
+              <w:t>Generates a hash-linked audit sequence so a later edit breaks the verification chain at the affected record.</w:t>
             </w:r>
           </w:p>
         </w:tc>
@@ -1952,7 +1938,7 @@
                 <w:sz w:val="17"/>
                 <w:szCs w:val="17"/>
               </w:rPr>
-              <w:t xml:space="preserve">Streams live system logs and traces to an AI model, which returns a ranked plain-English list of likely root causes — compressing hours of manual incident investigation into minutes. Actively maintained.</w:t>
+              <w:t>Turns live logs and traces into ranked root-cause hypotheses while keeping the underlying evidence available for engineer review.</w:t>
             </w:r>
           </w:p>
         </w:tc>
@@ -1971,7 +1957,7 @@
           <w:sz w:val="18"/>
           <w:szCs w:val="18"/>
         </w:rPr>
-        <w:t xml:space="preserve">15+ merged contributions to XGBoost &amp; scikit-learn  ·  12 public repositories  ·  each library has attracted external contributors</w:t>
+        <w:t>Public repositories and authored engineering notes: github.com/Scardubu  ·  scardubu.dev</w:t>
       </w:r>
     </w:p>
     <w:p>
@@ -2072,16 +2058,16 @@
           <w:sz w:val="20"/>
           <w:szCs w:val="20"/>
         </w:rPr>
-        <w:t xml:space="preserve">Technical author at scardubu.dev</w:t>
-      </w:r>
-      <w:r>
-        <w:rPr>
-          <w:rFonts w:ascii="Calibri" w:cs="Calibri" w:eastAsia="Calibri" w:hAnsi="Calibri"/>
-          <w:color w:val="0F1923"/>
-          <w:sz w:val="20"/>
-          <w:szCs w:val="20"/>
-        </w:rPr>
-        <w:t xml:space="preserve"> — publishing practical, in-depth engineering guides on backend reliability and AI tooling, read and referenced by developer teams across West Africa.</w:t>
+        <w:t>Technical author at scardubu.dev</w:t>
+      </w:r>
+      <w:r>
+        <w:rPr>
+          <w:rFonts w:ascii="Calibri" w:cs="Calibri" w:eastAsia="Calibri" w:hAnsi="Calibri"/>
+          <w:color w:val="0F1923"/>
+          <w:sz w:val="20"/>
+          <w:szCs w:val="20"/>
+        </w:rPr>
+        <w:t xml:space="preserve"> — publishing practical engineering guides on backend reliability, platform decisions, and AI infrastructure.</w:t>
       </w:r>
     </w:p>
     <w:p>
@@ -2340,7 +2326,7 @@
           <w:sz w:val="18"/>
           <w:szCs w:val="18"/>
         </w:rPr>
-        <w:t xml:space="preserve">Non-CS academic background. Technical credibility built through a decade of production-grade engineering, 4 active cloud certifications, and consistent open-source contributions.</w:t>
+        <w:t>Non-CS academic background. Certification details are resume-listed and available for verification on request; public repositories provide the inspectable engineering record.</w:t>
       </w:r>
     </w:p>
     <w:sectPr>

</xml_diff>